<commit_message>
HW6 updates, also modbus messengers logo
</commit_message>
<xml_diff>
--- a/CS3185/HW6/HW6.docx
+++ b/CS3185/HW6/HW6.docx
@@ -1042,984 +1042,939 @@
         <w:pStyle w:val="ListParagraph"/>
         <w:numPr>
           <w:ilvl w:val="0"/>
-          <w:numId w:val="1"/>
-        </w:numPr>
+          <w:numId w:val="8"/>
+        </w:numPr>
+      </w:pPr>
+      <w:r>
+        <w:t>δ</w:t>
+      </w:r>
+      <w:r>
+        <w:t xml:space="preserve"> </w:t>
+      </w:r>
+      <w:r>
+        <w:t xml:space="preserve">(q0, a) = (q1, </w:t>
+      </w:r>
+      <w:r>
+        <w:t>X</w:t>
+      </w:r>
+      <w:r>
+        <w:t xml:space="preserve">, </w:t>
+      </w:r>
+      <w:r>
+        <w:t>L</w:t>
+      </w:r>
+      <w:r>
+        <w:t>) –</w:t>
+      </w:r>
+      <w:r>
+        <w:t xml:space="preserve"> </w:t>
+      </w:r>
+      <w:r>
+        <w:t>mark</w:t>
+      </w:r>
+      <w:r>
+        <w:t xml:space="preserve"> located</w:t>
+      </w:r>
+      <w:r>
+        <w:t xml:space="preserve"> a</w:t>
+      </w:r>
+      <w:r>
+        <w:t xml:space="preserve">, start scanning for matching b (back to start of </w:t>
+      </w:r>
+      <w:r>
+        <w:t>string</w:t>
+      </w:r>
+      <w:r>
+        <w:t>)</w:t>
+      </w:r>
+    </w:p>
+    <w:p>
+      <w:pPr>
+        <w:pStyle w:val="ListParagraph"/>
+        <w:numPr>
+          <w:ilvl w:val="0"/>
+          <w:numId w:val="8"/>
+        </w:numPr>
+      </w:pPr>
+      <w:r>
+        <w:t xml:space="preserve">δ (q0, b) = </w:t>
+      </w:r>
+      <w:r>
+        <w:t>(q</w:t>
+      </w:r>
+      <w:r>
+        <w:t>0</w:t>
+      </w:r>
+      <w:r>
+        <w:t>, b, R)</w:t>
+      </w:r>
+      <w:r>
+        <w:t xml:space="preserve"> – skip other possible options</w:t>
+      </w:r>
+    </w:p>
+    <w:p>
+      <w:pPr>
+        <w:pStyle w:val="ListParagraph"/>
+        <w:numPr>
+          <w:ilvl w:val="0"/>
+          <w:numId w:val="8"/>
+        </w:numPr>
+      </w:pPr>
+      <w:proofErr w:type="gramStart"/>
+      <w:r>
+        <w:t>δ (q0, X) =</w:t>
+      </w:r>
+      <w:proofErr w:type="gramEnd"/>
+      <w:r>
+        <w:t xml:space="preserve"> (q0, X, R)</w:t>
+      </w:r>
+    </w:p>
+    <w:p>
+      <w:pPr>
+        <w:pStyle w:val="ListParagraph"/>
+        <w:numPr>
+          <w:ilvl w:val="0"/>
+          <w:numId w:val="8"/>
+        </w:numPr>
+      </w:pPr>
+      <w:proofErr w:type="gramStart"/>
+      <w:r>
+        <w:t>δ (q0, Y) =</w:t>
+      </w:r>
+      <w:proofErr w:type="gramEnd"/>
+      <w:r>
+        <w:t xml:space="preserve"> (q0, Y, R)</w:t>
+      </w:r>
+    </w:p>
+    <w:p>
+      <w:pPr>
+        <w:pStyle w:val="ListParagraph"/>
+        <w:numPr>
+          <w:ilvl w:val="0"/>
+          <w:numId w:val="8"/>
+        </w:numPr>
+      </w:pPr>
+      <w:r>
+        <w:t>δ (q0, □) = (q</w:t>
+      </w:r>
+      <w:r>
+        <w:t>4</w:t>
+      </w:r>
+      <w:r>
+        <w:t xml:space="preserve">, □, </w:t>
+      </w:r>
+      <w:r>
+        <w:t>L</w:t>
+      </w:r>
+      <w:r>
+        <w:t>) – no unmarked a’s</w:t>
+      </w:r>
+      <w:r>
+        <w:t xml:space="preserve">, start </w:t>
+      </w:r>
+      <w:r>
+        <w:t>scanning</w:t>
+      </w:r>
+      <w:r>
+        <w:t xml:space="preserve"> for an unmarked b for accept</w:t>
+      </w:r>
+    </w:p>
+    <w:p>
+      <w:pPr>
+        <w:pStyle w:val="ListParagraph"/>
         <w:ind w:left="360"/>
       </w:pPr>
-      <w:r>
-        <w:t>δ</w:t>
+    </w:p>
+    <w:p>
+      <w:pPr>
+        <w:pStyle w:val="ListParagraph"/>
+        <w:numPr>
+          <w:ilvl w:val="0"/>
+          <w:numId w:val="8"/>
+        </w:numPr>
+      </w:pPr>
+      <w:r>
+        <w:t>δ (q1, X) = (q1, X, L) – return to leftmost spot to start next scan</w:t>
+      </w:r>
+    </w:p>
+    <w:p>
+      <w:pPr>
+        <w:pStyle w:val="ListParagraph"/>
+        <w:numPr>
+          <w:ilvl w:val="0"/>
+          <w:numId w:val="8"/>
+        </w:numPr>
+      </w:pPr>
+      <w:r>
+        <w:t xml:space="preserve">δ (q1, Y) = (q1, </w:t>
+      </w:r>
+      <w:r>
+        <w:t>Y</w:t>
+      </w:r>
+      <w:r>
+        <w:t>, L)</w:t>
+      </w:r>
+    </w:p>
+    <w:p>
+      <w:pPr>
+        <w:pStyle w:val="ListParagraph"/>
+        <w:numPr>
+          <w:ilvl w:val="0"/>
+          <w:numId w:val="8"/>
+        </w:numPr>
+      </w:pPr>
+      <w:proofErr w:type="gramStart"/>
+      <w:r>
+        <w:t>δ (q1, a) =</w:t>
+      </w:r>
+      <w:proofErr w:type="gramEnd"/>
+      <w:r>
+        <w:t xml:space="preserve"> (q1, a, L)</w:t>
+      </w:r>
+    </w:p>
+    <w:p>
+      <w:pPr>
+        <w:pStyle w:val="ListParagraph"/>
+        <w:numPr>
+          <w:ilvl w:val="0"/>
+          <w:numId w:val="8"/>
+        </w:numPr>
+      </w:pPr>
+      <w:r>
+        <w:t>δ (q1, b) = (q1, b, L)</w:t>
+      </w:r>
+    </w:p>
+    <w:p>
+      <w:pPr>
+        <w:pStyle w:val="ListParagraph"/>
+        <w:numPr>
+          <w:ilvl w:val="0"/>
+          <w:numId w:val="8"/>
+        </w:numPr>
+      </w:pPr>
+      <w:r>
+        <w:t>δ (q1, □) = (q</w:t>
+      </w:r>
+      <w:r>
+        <w:t>2</w:t>
+      </w:r>
+      <w:r>
+        <w:t xml:space="preserve">, □, R) – </w:t>
+      </w:r>
+      <w:r>
+        <w:t>reset to start of string, start search for matching b</w:t>
+      </w:r>
+    </w:p>
+    <w:p>
+      <w:pPr>
+        <w:pStyle w:val="ListParagraph"/>
+        <w:ind w:left="360"/>
+      </w:pPr>
+    </w:p>
+    <w:p>
+      <w:pPr>
+        <w:pStyle w:val="ListParagraph"/>
+        <w:numPr>
+          <w:ilvl w:val="0"/>
+          <w:numId w:val="8"/>
+        </w:numPr>
+      </w:pPr>
+      <w:r>
+        <w:t>δ (</w:t>
+      </w:r>
+      <w:r>
+        <w:t>q2</w:t>
+      </w:r>
+      <w:r>
+        <w:t xml:space="preserve">, </w:t>
+      </w:r>
+      <w:r>
+        <w:t>b</w:t>
+      </w:r>
+      <w:r>
+        <w:t>) = (q</w:t>
+      </w:r>
+      <w:r>
+        <w:t>3</w:t>
+      </w:r>
+      <w:r>
+        <w:t xml:space="preserve">, </w:t>
+      </w:r>
+      <w:r>
+        <w:t>Y</w:t>
+      </w:r>
+      <w:r>
+        <w:t xml:space="preserve">, </w:t>
+      </w:r>
+      <w:r>
+        <w:t>L</w:t>
+      </w:r>
+      <w:r>
+        <w:t>)</w:t>
+      </w:r>
+      <w:r>
+        <w:t xml:space="preserve"> – </w:t>
+      </w:r>
+      <w:r>
+        <w:t xml:space="preserve">found a </w:t>
+      </w:r>
+      <w:r>
+        <w:t xml:space="preserve">matching </w:t>
+      </w:r>
+      <w:r>
+        <w:t>b</w:t>
+      </w:r>
+      <w:r>
+        <w:t>, head back to start to check again</w:t>
+      </w:r>
+    </w:p>
+    <w:p>
+      <w:pPr>
+        <w:pStyle w:val="ListParagraph"/>
+        <w:numPr>
+          <w:ilvl w:val="0"/>
+          <w:numId w:val="8"/>
+        </w:numPr>
+      </w:pPr>
+      <w:r>
+        <w:t>δ (</w:t>
+      </w:r>
+      <w:r>
+        <w:t>q2</w:t>
+      </w:r>
+      <w:r>
+        <w:t>, Y) = (</w:t>
+      </w:r>
+      <w:r>
+        <w:t>q2</w:t>
+      </w:r>
+      <w:r>
+        <w:t>, Y, R) – skip other possible options</w:t>
+      </w:r>
+    </w:p>
+    <w:p>
+      <w:pPr>
+        <w:pStyle w:val="ListParagraph"/>
+        <w:numPr>
+          <w:ilvl w:val="0"/>
+          <w:numId w:val="8"/>
+        </w:numPr>
+      </w:pPr>
+      <w:proofErr w:type="gramStart"/>
+      <w:r>
+        <w:t>δ (</w:t>
+      </w:r>
+      <w:r>
+        <w:t>q2</w:t>
+      </w:r>
+      <w:r>
+        <w:t>, X) =</w:t>
+      </w:r>
+      <w:proofErr w:type="gramEnd"/>
+      <w:r>
+        <w:t xml:space="preserve"> (</w:t>
+      </w:r>
+      <w:r>
+        <w:t>q2</w:t>
+      </w:r>
+      <w:r>
+        <w:t>, X, R)</w:t>
+      </w:r>
+    </w:p>
+    <w:p>
+      <w:pPr>
+        <w:pStyle w:val="ListParagraph"/>
+        <w:numPr>
+          <w:ilvl w:val="0"/>
+          <w:numId w:val="8"/>
+        </w:numPr>
+      </w:pPr>
+      <w:r>
+        <w:t>δ (</w:t>
+      </w:r>
+      <w:r>
+        <w:t>q2</w:t>
+      </w:r>
+      <w:r>
+        <w:t>, a) = (</w:t>
+      </w:r>
+      <w:r>
+        <w:t>q2</w:t>
+      </w:r>
+      <w:r>
+        <w:t>, a, R)</w:t>
+      </w:r>
+    </w:p>
+    <w:p>
+      <w:pPr>
+        <w:pStyle w:val="ListParagraph"/>
+        <w:numPr>
+          <w:ilvl w:val="0"/>
+          <w:numId w:val="8"/>
+        </w:numPr>
+      </w:pPr>
+      <w:r>
+        <w:t>δ (</w:t>
+      </w:r>
+      <w:r>
+        <w:t>q2</w:t>
+      </w:r>
+      <w:r>
+        <w:t>, □) = (q</w:t>
+      </w:r>
+      <w:r>
+        <w:t>6</w:t>
+      </w:r>
+      <w:r>
+        <w:t xml:space="preserve">, □, L) – no </w:t>
+      </w:r>
+      <w:r>
+        <w:t xml:space="preserve">unpaired </w:t>
+      </w:r>
+      <w:r>
+        <w:t xml:space="preserve">b found, </w:t>
+      </w:r>
+      <w:r>
+        <w:t xml:space="preserve">so </w:t>
+      </w:r>
+      <w:proofErr w:type="spellStart"/>
+      <w:r>
+        <w:t>n</w:t>
+      </w:r>
+      <w:r>
+        <w:rPr>
+          <w:vertAlign w:val="subscript"/>
+        </w:rPr>
+        <w:t>a</w:t>
+      </w:r>
+      <w:proofErr w:type="spellEnd"/>
+      <w:r>
+        <w:t xml:space="preserve">(a) &gt; </w:t>
+      </w:r>
+      <w:proofErr w:type="spellStart"/>
+      <w:r>
+        <w:t>n</w:t>
+      </w:r>
+      <w:r>
+        <w:rPr>
+          <w:vertAlign w:val="subscript"/>
+        </w:rPr>
+        <w:t>a</w:t>
+      </w:r>
+      <w:proofErr w:type="spellEnd"/>
+      <w:r>
+        <w:t>(b), head to accept</w:t>
+      </w:r>
+    </w:p>
+    <w:p>
+      <w:pPr>
+        <w:pStyle w:val="ListParagraph"/>
+        <w:ind w:left="360"/>
+      </w:pPr>
+    </w:p>
+    <w:p>
+      <w:pPr>
+        <w:pStyle w:val="ListParagraph"/>
+        <w:numPr>
+          <w:ilvl w:val="0"/>
+          <w:numId w:val="8"/>
+        </w:numPr>
+      </w:pPr>
+      <w:r>
+        <w:t>δ (</w:t>
+      </w:r>
+      <w:r>
+        <w:t>q3</w:t>
+      </w:r>
+      <w:r>
+        <w:t>, X) = (</w:t>
+      </w:r>
+      <w:r>
+        <w:t>q3</w:t>
+      </w:r>
+      <w:r>
+        <w:t>, X, L)</w:t>
+      </w:r>
+      <w:r>
+        <w:t xml:space="preserve"> – return to leftmost spot to start next scan</w:t>
+      </w:r>
+    </w:p>
+    <w:p>
+      <w:pPr>
+        <w:pStyle w:val="ListParagraph"/>
+        <w:numPr>
+          <w:ilvl w:val="0"/>
+          <w:numId w:val="8"/>
+        </w:numPr>
+      </w:pPr>
+      <w:r>
+        <w:t>δ (</w:t>
+      </w:r>
+      <w:r>
+        <w:t>q3</w:t>
+      </w:r>
+      <w:r>
+        <w:t>, Y) = (</w:t>
+      </w:r>
+      <w:r>
+        <w:t>q3</w:t>
+      </w:r>
+      <w:r>
+        <w:t xml:space="preserve">, </w:t>
+      </w:r>
+      <w:r>
+        <w:t>Y</w:t>
+      </w:r>
+      <w:r>
+        <w:t>, L)</w:t>
+      </w:r>
+    </w:p>
+    <w:p>
+      <w:pPr>
+        <w:pStyle w:val="ListParagraph"/>
+        <w:numPr>
+          <w:ilvl w:val="0"/>
+          <w:numId w:val="8"/>
+        </w:numPr>
+      </w:pPr>
+      <w:r>
+        <w:t>δ (</w:t>
+      </w:r>
+      <w:r>
+        <w:t>q3</w:t>
+      </w:r>
+      <w:r>
+        <w:t>, a) = (</w:t>
+      </w:r>
+      <w:r>
+        <w:t>q3</w:t>
+      </w:r>
+      <w:r>
+        <w:t>, a, L)</w:t>
+      </w:r>
+    </w:p>
+    <w:p>
+      <w:pPr>
+        <w:pStyle w:val="ListParagraph"/>
+        <w:numPr>
+          <w:ilvl w:val="0"/>
+          <w:numId w:val="8"/>
+        </w:numPr>
+      </w:pPr>
+      <w:r>
+        <w:t>δ (</w:t>
+      </w:r>
+      <w:r>
+        <w:t>q3</w:t>
+      </w:r>
+      <w:r>
+        <w:t>, b) = (</w:t>
+      </w:r>
+      <w:r>
+        <w:t>q3</w:t>
+      </w:r>
+      <w:r>
+        <w:t>, b, L)</w:t>
+      </w:r>
+    </w:p>
+    <w:p>
+      <w:pPr>
+        <w:pStyle w:val="ListParagraph"/>
+        <w:numPr>
+          <w:ilvl w:val="0"/>
+          <w:numId w:val="8"/>
+        </w:numPr>
+      </w:pPr>
+      <w:r>
+        <w:t>δ (</w:t>
+      </w:r>
+      <w:r>
+        <w:t>q3</w:t>
+      </w:r>
+      <w:r>
+        <w:t xml:space="preserve">, □) = (q0, □, R) – back at start of </w:t>
+      </w:r>
+      <w:r>
+        <w:t>string</w:t>
+      </w:r>
+      <w:r>
+        <w:t>, start next scan</w:t>
+      </w:r>
+    </w:p>
+    <w:p>
+      <w:pPr>
+        <w:pStyle w:val="ListParagraph"/>
+        <w:ind w:left="360"/>
+      </w:pPr>
+    </w:p>
+    <w:p>
+      <w:pPr>
+        <w:pStyle w:val="ListParagraph"/>
+        <w:numPr>
+          <w:ilvl w:val="0"/>
+          <w:numId w:val="8"/>
+        </w:numPr>
+      </w:pPr>
+      <w:r>
+        <w:t>δ (q4, X) = (q4, X, L) – return to leftmost spot to start check for unpaired b</w:t>
+      </w:r>
+    </w:p>
+    <w:p>
+      <w:pPr>
+        <w:pStyle w:val="ListParagraph"/>
+        <w:numPr>
+          <w:ilvl w:val="0"/>
+          <w:numId w:val="8"/>
+        </w:numPr>
+      </w:pPr>
+      <w:r>
+        <w:t>δ (q4, Y) = (q4, Y, L)</w:t>
+      </w:r>
+    </w:p>
+    <w:p>
+      <w:pPr>
+        <w:pStyle w:val="ListParagraph"/>
+        <w:numPr>
+          <w:ilvl w:val="0"/>
+          <w:numId w:val="8"/>
+        </w:numPr>
+      </w:pPr>
+      <w:r>
+        <w:t>δ (q4, a) = (q4, a, L)</w:t>
+      </w:r>
+    </w:p>
+    <w:p>
+      <w:pPr>
+        <w:pStyle w:val="ListParagraph"/>
+        <w:numPr>
+          <w:ilvl w:val="0"/>
+          <w:numId w:val="8"/>
+        </w:numPr>
+      </w:pPr>
+      <w:r>
+        <w:t>δ (q4, b) = (q4, b, L)</w:t>
+      </w:r>
+    </w:p>
+    <w:p>
+      <w:pPr>
+        <w:pStyle w:val="ListParagraph"/>
+        <w:numPr>
+          <w:ilvl w:val="0"/>
+          <w:numId w:val="8"/>
+        </w:numPr>
+      </w:pPr>
+      <w:r>
+        <w:t xml:space="preserve">δ (q4, □) = (q5, □, R) – back at start of </w:t>
+      </w:r>
+      <w:r>
+        <w:t>string</w:t>
+      </w:r>
+      <w:r>
+        <w:t>, start next scan</w:t>
+      </w:r>
+    </w:p>
+    <w:p>
+      <w:pPr>
+        <w:pStyle w:val="ListParagraph"/>
+        <w:ind w:left="360"/>
+      </w:pPr>
+    </w:p>
+    <w:p>
+      <w:pPr>
+        <w:pStyle w:val="ListParagraph"/>
+        <w:numPr>
+          <w:ilvl w:val="0"/>
+          <w:numId w:val="8"/>
+        </w:numPr>
+      </w:pPr>
+      <w:r>
+        <w:t>δ (</w:t>
+      </w:r>
+      <w:r>
+        <w:t>q5</w:t>
+      </w:r>
+      <w:r>
+        <w:t xml:space="preserve">, </w:t>
+      </w:r>
+      <w:r>
+        <w:t>b</w:t>
+      </w:r>
+      <w:r>
+        <w:t>) = (q</w:t>
+      </w:r>
+      <w:r>
+        <w:t>6</w:t>
+      </w:r>
+      <w:r>
+        <w:t xml:space="preserve">, </w:t>
+      </w:r>
+      <w:r>
+        <w:t>b</w:t>
+      </w:r>
+      <w:r>
+        <w:t>, R)</w:t>
+      </w:r>
+      <w:r>
+        <w:t xml:space="preserve"> – Found an extra b</w:t>
+      </w:r>
+      <w:r>
+        <w:t xml:space="preserve"> so </w:t>
+      </w:r>
+      <w:proofErr w:type="spellStart"/>
+      <w:r>
+        <w:t>n</w:t>
+      </w:r>
+      <w:r>
+        <w:rPr>
+          <w:vertAlign w:val="subscript"/>
+        </w:rPr>
+        <w:t>a</w:t>
+      </w:r>
+      <w:proofErr w:type="spellEnd"/>
+      <w:r>
+        <w:t xml:space="preserve">(b) &gt; </w:t>
+      </w:r>
+      <w:proofErr w:type="spellStart"/>
+      <w:r>
+        <w:t>n</w:t>
+      </w:r>
+      <w:r>
+        <w:rPr>
+          <w:vertAlign w:val="subscript"/>
+        </w:rPr>
+        <w:t>a</w:t>
+      </w:r>
+      <w:proofErr w:type="spellEnd"/>
+      <w:r>
+        <w:t>(a)</w:t>
+      </w:r>
+      <w:r>
+        <w:t>, head to accept</w:t>
+      </w:r>
+    </w:p>
+    <w:p>
+      <w:pPr>
+        <w:pStyle w:val="ListParagraph"/>
+        <w:numPr>
+          <w:ilvl w:val="0"/>
+          <w:numId w:val="8"/>
+        </w:numPr>
+      </w:pPr>
+      <w:r>
+        <w:t>δ (</w:t>
+      </w:r>
+      <w:r>
+        <w:t>q5</w:t>
+      </w:r>
+      <w:r>
+        <w:t>, Y) = (</w:t>
+      </w:r>
+      <w:r>
+        <w:t>q5</w:t>
+      </w:r>
+      <w:r>
+        <w:t>, Y, R)</w:t>
+      </w:r>
+      <w:r>
+        <w:t xml:space="preserve"> – Check rest of string for unpaired b’s</w:t>
+      </w:r>
+    </w:p>
+    <w:p>
+      <w:pPr>
+        <w:pStyle w:val="ListParagraph"/>
+        <w:numPr>
+          <w:ilvl w:val="0"/>
+          <w:numId w:val="8"/>
+        </w:numPr>
+      </w:pPr>
+      <w:r>
+        <w:t>δ (</w:t>
+      </w:r>
+      <w:r>
+        <w:t>q5</w:t>
+      </w:r>
+      <w:r>
+        <w:t>, X) = (</w:t>
+      </w:r>
+      <w:r>
+        <w:t>q5</w:t>
+      </w:r>
+      <w:r>
+        <w:t>, X, R)</w:t>
+      </w:r>
+    </w:p>
+    <w:p>
+      <w:pPr>
+        <w:pStyle w:val="ListParagraph"/>
+        <w:numPr>
+          <w:ilvl w:val="0"/>
+          <w:numId w:val="8"/>
+        </w:numPr>
+      </w:pPr>
+      <w:r>
+        <w:t>δ (</w:t>
+      </w:r>
+      <w:r>
+        <w:t>q5</w:t>
+      </w:r>
+      <w:r>
+        <w:t>, a) = (</w:t>
+      </w:r>
+      <w:r>
+        <w:t>q5</w:t>
+      </w:r>
+      <w:r>
+        <w:t>, a, R)</w:t>
+      </w:r>
+    </w:p>
+    <w:p>
+      <w:pPr>
+        <w:pStyle w:val="ListParagraph"/>
+        <w:numPr>
+          <w:ilvl w:val="0"/>
+          <w:numId w:val="8"/>
+        </w:numPr>
+      </w:pPr>
+      <w:r>
+        <w:t>δ (</w:t>
+      </w:r>
+      <w:r>
+        <w:t>q5</w:t>
+      </w:r>
+      <w:r>
+        <w:t>, □) = (q</w:t>
+      </w:r>
+      <w:r>
+        <w:t>8</w:t>
+      </w:r>
+      <w:r>
+        <w:t xml:space="preserve">, □, </w:t>
+      </w:r>
+      <w:r>
+        <w:t>L</w:t>
+      </w:r>
+      <w:r>
+        <w:t>)</w:t>
+      </w:r>
+      <w:r>
+        <w:t xml:space="preserve"> – No unpaired b found</w:t>
+      </w:r>
+      <w:r>
+        <w:t>, so</w:t>
       </w:r>
       <w:r>
         <w:t xml:space="preserve"> </w:t>
       </w:r>
-      <w:r>
-        <w:t xml:space="preserve">(q0, a) = (q1, </w:t>
-      </w:r>
-      <w:r>
-        <w:t>X</w:t>
-      </w:r>
-      <w:r>
-        <w:t xml:space="preserve">, </w:t>
-      </w:r>
-      <w:r>
-        <w:t>L</w:t>
-      </w:r>
-      <w:r>
-        <w:t>) –</w:t>
-      </w:r>
-      <w:r>
-        <w:t xml:space="preserve"> </w:t>
-      </w:r>
-      <w:r>
-        <w:t>mark</w:t>
-      </w:r>
-      <w:r>
-        <w:t xml:space="preserve"> located</w:t>
-      </w:r>
-      <w:r>
-        <w:t xml:space="preserve"> a</w:t>
-      </w:r>
-      <w:r>
-        <w:t xml:space="preserve">, start scanning for matching b (back to start of </w:t>
+      <w:proofErr w:type="spellStart"/>
+      <w:r>
+        <w:t>n</w:t>
+      </w:r>
+      <w:r>
+        <w:rPr>
+          <w:vertAlign w:val="subscript"/>
+        </w:rPr>
+        <w:t>a</w:t>
+      </w:r>
+      <w:proofErr w:type="spellEnd"/>
+      <w:r>
+        <w:t xml:space="preserve">(a) = </w:t>
+      </w:r>
+      <w:proofErr w:type="spellStart"/>
+      <w:r>
+        <w:t>n</w:t>
+      </w:r>
+      <w:r>
+        <w:rPr>
+          <w:vertAlign w:val="subscript"/>
+        </w:rPr>
+        <w:t>a</w:t>
+      </w:r>
+      <w:proofErr w:type="spellEnd"/>
+      <w:r>
+        <w:t>(b)</w:t>
+      </w:r>
+      <w:r>
+        <w:t>, rejected</w:t>
+      </w:r>
+    </w:p>
+    <w:p>
+      <w:pPr>
+        <w:pStyle w:val="ListParagraph"/>
+        <w:ind w:left="360"/>
+      </w:pPr>
+    </w:p>
+    <w:p>
+      <w:pPr>
+        <w:pStyle w:val="ListParagraph"/>
+        <w:numPr>
+          <w:ilvl w:val="0"/>
+          <w:numId w:val="8"/>
+        </w:numPr>
+      </w:pPr>
+      <w:r>
+        <w:t xml:space="preserve">δ (q6, a) = (q6, a, R) – move to end of </w:t>
       </w:r>
       <w:r>
         <w:t>string</w:t>
       </w:r>
       <w:r>
-        <w:t>)</w:t>
-      </w:r>
-    </w:p>
-    <w:p>
-      <w:pPr>
-        <w:pStyle w:val="ListParagraph"/>
-        <w:numPr>
-          <w:ilvl w:val="0"/>
-          <w:numId w:val="1"/>
-        </w:numPr>
-        <w:ind w:left="360"/>
-      </w:pPr>
-      <w:r>
-        <w:t xml:space="preserve">δ (q0, b) = </w:t>
-      </w:r>
-      <w:r>
-        <w:t>(q</w:t>
-      </w:r>
-      <w:r>
-        <w:t>0</w:t>
-      </w:r>
-      <w:r>
-        <w:t>, b, R)</w:t>
-      </w:r>
-      <w:r>
-        <w:t xml:space="preserve"> – skip other possible options</w:t>
-      </w:r>
-    </w:p>
-    <w:p>
-      <w:pPr>
-        <w:pStyle w:val="ListParagraph"/>
-        <w:numPr>
-          <w:ilvl w:val="0"/>
-          <w:numId w:val="1"/>
-        </w:numPr>
-        <w:ind w:left="360"/>
-      </w:pPr>
-      <w:proofErr w:type="gramStart"/>
-      <w:r>
-        <w:t>δ (q0, X) =</w:t>
-      </w:r>
-      <w:proofErr w:type="gramEnd"/>
-      <w:r>
-        <w:t xml:space="preserve"> (q0, X, R)</w:t>
-      </w:r>
-    </w:p>
-    <w:p>
-      <w:pPr>
-        <w:pStyle w:val="ListParagraph"/>
-        <w:numPr>
-          <w:ilvl w:val="0"/>
-          <w:numId w:val="1"/>
-        </w:numPr>
-        <w:ind w:left="360"/>
-      </w:pPr>
-      <w:proofErr w:type="gramStart"/>
-      <w:r>
-        <w:t>δ (q0, Y) =</w:t>
-      </w:r>
-      <w:proofErr w:type="gramEnd"/>
-      <w:r>
-        <w:t xml:space="preserve"> (q0, Y, R)</w:t>
-      </w:r>
-    </w:p>
-    <w:p>
-      <w:pPr>
-        <w:pStyle w:val="ListParagraph"/>
-        <w:numPr>
-          <w:ilvl w:val="0"/>
-          <w:numId w:val="1"/>
-        </w:numPr>
-        <w:ind w:left="360"/>
-      </w:pPr>
-      <w:r>
-        <w:t>δ (q0, □) = (q</w:t>
-      </w:r>
-      <w:r>
-        <w:t>4</w:t>
-      </w:r>
-      <w:r>
-        <w:t xml:space="preserve">, □, </w:t>
-      </w:r>
-      <w:r>
-        <w:t>L</w:t>
-      </w:r>
-      <w:r>
-        <w:t>) – no unmarked a’s</w:t>
-      </w:r>
-      <w:r>
-        <w:t xml:space="preserve">, start </w:t>
-      </w:r>
-      <w:r>
-        <w:t>scanning</w:t>
-      </w:r>
-      <w:r>
-        <w:t xml:space="preserve"> for an unmarked b for accept</w:t>
-      </w:r>
-    </w:p>
-    <w:p>
-      <w:pPr>
-        <w:pStyle w:val="ListParagraph"/>
-        <w:ind w:left="360"/>
-      </w:pPr>
-    </w:p>
-    <w:p>
-      <w:pPr>
-        <w:pStyle w:val="ListParagraph"/>
-        <w:numPr>
-          <w:ilvl w:val="0"/>
-          <w:numId w:val="1"/>
-        </w:numPr>
-        <w:ind w:left="360"/>
-      </w:pPr>
-      <w:r>
-        <w:t>δ (q1, X) = (q1, X, L) – return to leftmost spot to start next scan</w:t>
-      </w:r>
-    </w:p>
-    <w:p>
-      <w:pPr>
-        <w:pStyle w:val="ListParagraph"/>
-        <w:numPr>
-          <w:ilvl w:val="0"/>
-          <w:numId w:val="1"/>
-        </w:numPr>
-        <w:ind w:left="360"/>
-      </w:pPr>
-      <w:r>
-        <w:t xml:space="preserve">δ (q1, Y) = (q1, </w:t>
-      </w:r>
-      <w:r>
-        <w:t>Y</w:t>
-      </w:r>
-      <w:r>
-        <w:t>, L)</w:t>
-      </w:r>
-    </w:p>
-    <w:p>
-      <w:pPr>
-        <w:pStyle w:val="ListParagraph"/>
-        <w:numPr>
-          <w:ilvl w:val="0"/>
-          <w:numId w:val="1"/>
-        </w:numPr>
-        <w:ind w:left="360"/>
-      </w:pPr>
-      <w:proofErr w:type="gramStart"/>
-      <w:r>
-        <w:t>δ (q1, a) =</w:t>
-      </w:r>
-      <w:proofErr w:type="gramEnd"/>
-      <w:r>
-        <w:t xml:space="preserve"> (q1, a, L)</w:t>
-      </w:r>
-    </w:p>
-    <w:p>
-      <w:pPr>
-        <w:pStyle w:val="ListParagraph"/>
-        <w:numPr>
-          <w:ilvl w:val="0"/>
-          <w:numId w:val="1"/>
-        </w:numPr>
-        <w:ind w:left="360"/>
-      </w:pPr>
-      <w:r>
-        <w:t>δ (q1, b) = (q1, b, L)</w:t>
-      </w:r>
-    </w:p>
-    <w:p>
-      <w:pPr>
-        <w:pStyle w:val="ListParagraph"/>
-        <w:numPr>
-          <w:ilvl w:val="0"/>
-          <w:numId w:val="1"/>
-        </w:numPr>
-        <w:ind w:left="360"/>
-      </w:pPr>
-      <w:r>
-        <w:t>δ (q1, □) = (q</w:t>
-      </w:r>
-      <w:r>
-        <w:t>2</w:t>
-      </w:r>
-      <w:r>
-        <w:t xml:space="preserve">, □, R) – </w:t>
-      </w:r>
-      <w:r>
-        <w:t>reset to start of string, start search for matching b</w:t>
-      </w:r>
-    </w:p>
-    <w:p>
-      <w:pPr>
-        <w:pStyle w:val="ListParagraph"/>
-        <w:ind w:left="360"/>
-      </w:pPr>
-    </w:p>
-    <w:p>
-      <w:pPr>
-        <w:pStyle w:val="ListParagraph"/>
-        <w:numPr>
-          <w:ilvl w:val="0"/>
-          <w:numId w:val="1"/>
-        </w:numPr>
-        <w:ind w:left="360"/>
-      </w:pPr>
-      <w:r>
-        <w:t>δ (</w:t>
-      </w:r>
-      <w:r>
-        <w:t>q2</w:t>
-      </w:r>
-      <w:r>
-        <w:t xml:space="preserve">, </w:t>
-      </w:r>
-      <w:r>
-        <w:t>b</w:t>
-      </w:r>
-      <w:r>
-        <w:t>) = (q</w:t>
-      </w:r>
-      <w:r>
-        <w:t>3</w:t>
-      </w:r>
-      <w:r>
-        <w:t xml:space="preserve">, </w:t>
-      </w:r>
-      <w:r>
-        <w:t>Y</w:t>
-      </w:r>
-      <w:r>
-        <w:t xml:space="preserve">, </w:t>
-      </w:r>
-      <w:r>
-        <w:t>L</w:t>
-      </w:r>
-      <w:r>
-        <w:t>)</w:t>
-      </w:r>
-      <w:r>
-        <w:t xml:space="preserve"> – </w:t>
-      </w:r>
-      <w:r>
-        <w:t xml:space="preserve">found a </w:t>
-      </w:r>
-      <w:r>
-        <w:t xml:space="preserve">matching </w:t>
-      </w:r>
-      <w:r>
-        <w:t>b</w:t>
-      </w:r>
-      <w:r>
-        <w:t>, head back to start to check again</w:t>
-      </w:r>
-    </w:p>
-    <w:p>
-      <w:pPr>
-        <w:pStyle w:val="ListParagraph"/>
-        <w:numPr>
-          <w:ilvl w:val="0"/>
-          <w:numId w:val="1"/>
-        </w:numPr>
-        <w:ind w:left="360"/>
-      </w:pPr>
-      <w:r>
-        <w:t>δ (</w:t>
-      </w:r>
-      <w:r>
-        <w:t>q2</w:t>
-      </w:r>
-      <w:r>
-        <w:t>, Y) = (</w:t>
-      </w:r>
-      <w:r>
-        <w:t>q2</w:t>
-      </w:r>
-      <w:r>
-        <w:t>, Y, R) – skip other possible options</w:t>
-      </w:r>
-    </w:p>
-    <w:p>
-      <w:pPr>
-        <w:pStyle w:val="ListParagraph"/>
-        <w:numPr>
-          <w:ilvl w:val="0"/>
-          <w:numId w:val="1"/>
-        </w:numPr>
-        <w:ind w:left="360"/>
-      </w:pPr>
-      <w:proofErr w:type="gramStart"/>
-      <w:r>
-        <w:t>δ (</w:t>
-      </w:r>
-      <w:r>
-        <w:t>q2</w:t>
-      </w:r>
-      <w:r>
-        <w:t>, X) =</w:t>
-      </w:r>
-      <w:proofErr w:type="gramEnd"/>
-      <w:r>
-        <w:t xml:space="preserve"> (</w:t>
-      </w:r>
-      <w:r>
-        <w:t>q2</w:t>
-      </w:r>
-      <w:r>
-        <w:t>, X, R)</w:t>
-      </w:r>
-    </w:p>
-    <w:p>
-      <w:pPr>
-        <w:pStyle w:val="ListParagraph"/>
-        <w:numPr>
-          <w:ilvl w:val="0"/>
-          <w:numId w:val="1"/>
-        </w:numPr>
-        <w:ind w:left="360"/>
-      </w:pPr>
-      <w:r>
-        <w:t>δ (</w:t>
-      </w:r>
-      <w:r>
-        <w:t>q2</w:t>
-      </w:r>
-      <w:r>
-        <w:t>, a) = (</w:t>
-      </w:r>
-      <w:r>
-        <w:t>q2</w:t>
-      </w:r>
-      <w:r>
-        <w:t>, a, R)</w:t>
-      </w:r>
-    </w:p>
-    <w:p>
-      <w:pPr>
-        <w:pStyle w:val="ListParagraph"/>
-        <w:numPr>
-          <w:ilvl w:val="0"/>
-          <w:numId w:val="1"/>
-        </w:numPr>
-        <w:ind w:left="360"/>
-      </w:pPr>
-      <w:r>
-        <w:t>δ (</w:t>
-      </w:r>
-      <w:r>
-        <w:t>q2</w:t>
+        <w:t xml:space="preserve"> to accept</w:t>
+      </w:r>
+    </w:p>
+    <w:p>
+      <w:pPr>
+        <w:pStyle w:val="ListParagraph"/>
+        <w:numPr>
+          <w:ilvl w:val="0"/>
+          <w:numId w:val="8"/>
+        </w:numPr>
+      </w:pPr>
+      <w:r>
+        <w:t>δ (q6, b) = (q6, b, R)</w:t>
+      </w:r>
+    </w:p>
+    <w:p>
+      <w:pPr>
+        <w:pStyle w:val="ListParagraph"/>
+        <w:numPr>
+          <w:ilvl w:val="0"/>
+          <w:numId w:val="8"/>
+        </w:numPr>
+      </w:pPr>
+      <w:r>
+        <w:t>δ (q6, X) = (q6, X, R)</w:t>
+      </w:r>
+    </w:p>
+    <w:p>
+      <w:pPr>
+        <w:pStyle w:val="ListParagraph"/>
+        <w:numPr>
+          <w:ilvl w:val="0"/>
+          <w:numId w:val="8"/>
+        </w:numPr>
+      </w:pPr>
+      <w:r>
+        <w:t>δ (q6, Y) = (q6, Y, R)</w:t>
+      </w:r>
+    </w:p>
+    <w:p>
+      <w:pPr>
+        <w:pStyle w:val="ListParagraph"/>
+        <w:numPr>
+          <w:ilvl w:val="0"/>
+          <w:numId w:val="8"/>
+        </w:numPr>
+      </w:pPr>
+      <w:r>
+        <w:t>δ (q</w:t>
+      </w:r>
+      <w:r>
+        <w:t>6</w:t>
       </w:r>
       <w:r>
         <w:t>, □) = (q</w:t>
       </w:r>
       <w:r>
-        <w:t>6</w:t>
-      </w:r>
-      <w:r>
-        <w:t xml:space="preserve">, □, L) – no </w:t>
-      </w:r>
-      <w:r>
-        <w:t xml:space="preserve">unpaired </w:t>
-      </w:r>
-      <w:r>
-        <w:t xml:space="preserve">b found, </w:t>
-      </w:r>
-      <w:r>
-        <w:t xml:space="preserve">so </w:t>
-      </w:r>
-      <w:proofErr w:type="spellStart"/>
-      <w:r>
-        <w:t>n</w:t>
-      </w:r>
-      <w:r>
-        <w:rPr>
-          <w:vertAlign w:val="subscript"/>
-        </w:rPr>
-        <w:t>a</w:t>
-      </w:r>
-      <w:proofErr w:type="spellEnd"/>
-      <w:r>
-        <w:t xml:space="preserve">(a) &gt; </w:t>
-      </w:r>
-      <w:proofErr w:type="spellStart"/>
-      <w:r>
-        <w:t>n</w:t>
-      </w:r>
-      <w:r>
-        <w:rPr>
-          <w:vertAlign w:val="subscript"/>
-        </w:rPr>
-        <w:t>a</w:t>
-      </w:r>
-      <w:proofErr w:type="spellEnd"/>
-      <w:r>
-        <w:t>(b), head to accept</w:t>
-      </w:r>
-    </w:p>
-    <w:p>
-      <w:pPr>
-        <w:pStyle w:val="ListParagraph"/>
-        <w:ind w:left="360"/>
-      </w:pPr>
-    </w:p>
-    <w:p>
-      <w:pPr>
-        <w:pStyle w:val="ListParagraph"/>
-        <w:numPr>
-          <w:ilvl w:val="0"/>
-          <w:numId w:val="1"/>
-        </w:numPr>
-        <w:ind w:left="360"/>
-      </w:pPr>
-      <w:r>
-        <w:t>δ (</w:t>
-      </w:r>
-      <w:r>
-        <w:t>q3</w:t>
-      </w:r>
-      <w:r>
-        <w:t>, X) = (</w:t>
-      </w:r>
-      <w:r>
-        <w:t>q3</w:t>
-      </w:r>
-      <w:r>
-        <w:t>, X, L)</w:t>
-      </w:r>
-      <w:r>
-        <w:t xml:space="preserve"> – return to leftmost spot to start next scan</w:t>
-      </w:r>
-    </w:p>
-    <w:p>
-      <w:pPr>
-        <w:pStyle w:val="ListParagraph"/>
-        <w:numPr>
-          <w:ilvl w:val="0"/>
-          <w:numId w:val="1"/>
-        </w:numPr>
-        <w:ind w:left="360"/>
-      </w:pPr>
-      <w:r>
-        <w:t>δ (</w:t>
-      </w:r>
-      <w:r>
-        <w:t>q3</w:t>
-      </w:r>
-      <w:r>
-        <w:t>, Y) = (</w:t>
-      </w:r>
-      <w:r>
-        <w:t>q3</w:t>
-      </w:r>
-      <w:r>
-        <w:t xml:space="preserve">, </w:t>
-      </w:r>
-      <w:r>
-        <w:t>Y</w:t>
-      </w:r>
-      <w:r>
-        <w:t>, L)</w:t>
-      </w:r>
-    </w:p>
-    <w:p>
-      <w:pPr>
-        <w:pStyle w:val="ListParagraph"/>
-        <w:numPr>
-          <w:ilvl w:val="0"/>
-          <w:numId w:val="1"/>
-        </w:numPr>
-        <w:ind w:left="360"/>
-      </w:pPr>
-      <w:r>
-        <w:t>δ (</w:t>
-      </w:r>
-      <w:r>
-        <w:t>q3</w:t>
-      </w:r>
-      <w:r>
-        <w:t>, a) = (</w:t>
-      </w:r>
-      <w:r>
-        <w:t>q3</w:t>
-      </w:r>
-      <w:r>
-        <w:t>, a, L)</w:t>
-      </w:r>
-    </w:p>
-    <w:p>
-      <w:pPr>
-        <w:pStyle w:val="ListParagraph"/>
-        <w:numPr>
-          <w:ilvl w:val="0"/>
-          <w:numId w:val="1"/>
-        </w:numPr>
-        <w:ind w:left="360"/>
-      </w:pPr>
-      <w:r>
-        <w:t>δ (</w:t>
-      </w:r>
-      <w:r>
-        <w:t>q3</w:t>
-      </w:r>
-      <w:r>
-        <w:t>, b) = (</w:t>
-      </w:r>
-      <w:r>
-        <w:t>q3</w:t>
-      </w:r>
-      <w:r>
-        <w:t>, b, L)</w:t>
-      </w:r>
-    </w:p>
-    <w:p>
-      <w:pPr>
-        <w:pStyle w:val="ListParagraph"/>
-        <w:numPr>
-          <w:ilvl w:val="0"/>
-          <w:numId w:val="1"/>
-        </w:numPr>
-        <w:ind w:left="360"/>
-      </w:pPr>
-      <w:r>
-        <w:t>δ (</w:t>
-      </w:r>
-      <w:r>
-        <w:t>q3</w:t>
-      </w:r>
-      <w:r>
-        <w:t>, □) = (q0, □, R) – back at start of tape, start next scan</w:t>
-      </w:r>
-    </w:p>
-    <w:p>
-      <w:pPr>
-        <w:pStyle w:val="ListParagraph"/>
-        <w:ind w:left="360"/>
-      </w:pPr>
-    </w:p>
-    <w:p>
-      <w:pPr>
-        <w:pStyle w:val="ListParagraph"/>
-        <w:numPr>
-          <w:ilvl w:val="0"/>
-          <w:numId w:val="1"/>
-        </w:numPr>
-        <w:ind w:left="360"/>
-      </w:pPr>
-      <w:r>
-        <w:t>δ (q4, X) = (q4, X, L) – return to leftmost spot to start check for unpaired b</w:t>
-      </w:r>
-    </w:p>
-    <w:p>
-      <w:pPr>
-        <w:pStyle w:val="ListParagraph"/>
-        <w:numPr>
-          <w:ilvl w:val="0"/>
-          <w:numId w:val="1"/>
-        </w:numPr>
-        <w:ind w:left="360"/>
-      </w:pPr>
-      <w:r>
-        <w:t>δ (q4, Y) = (q4, Y, L)</w:t>
-      </w:r>
-    </w:p>
-    <w:p>
-      <w:pPr>
-        <w:pStyle w:val="ListParagraph"/>
-        <w:numPr>
-          <w:ilvl w:val="0"/>
-          <w:numId w:val="1"/>
-        </w:numPr>
-        <w:ind w:left="360"/>
-      </w:pPr>
-      <w:r>
-        <w:t>δ (q4, a) = (q4, a, L)</w:t>
-      </w:r>
-    </w:p>
-    <w:p>
-      <w:pPr>
-        <w:pStyle w:val="ListParagraph"/>
-        <w:numPr>
-          <w:ilvl w:val="0"/>
-          <w:numId w:val="1"/>
-        </w:numPr>
-        <w:ind w:left="360"/>
-      </w:pPr>
-      <w:r>
-        <w:t>δ (q4, b) = (q4, b, L)</w:t>
-      </w:r>
-    </w:p>
-    <w:p>
-      <w:pPr>
-        <w:pStyle w:val="ListParagraph"/>
-        <w:numPr>
-          <w:ilvl w:val="0"/>
-          <w:numId w:val="1"/>
-        </w:numPr>
-        <w:ind w:left="360"/>
-      </w:pPr>
-      <w:r>
-        <w:t>δ (q4, □) = (q5, □, R) – back at start of tape, start next scan</w:t>
-      </w:r>
-    </w:p>
-    <w:p>
-      <w:pPr>
-        <w:pStyle w:val="ListParagraph"/>
-        <w:ind w:left="360"/>
-      </w:pPr>
-    </w:p>
-    <w:p>
-      <w:pPr>
-        <w:pStyle w:val="ListParagraph"/>
-        <w:numPr>
-          <w:ilvl w:val="0"/>
-          <w:numId w:val="1"/>
-        </w:numPr>
-        <w:ind w:left="360"/>
-      </w:pPr>
-      <w:r>
-        <w:t>δ (</w:t>
-      </w:r>
-      <w:r>
-        <w:t>q5</w:t>
-      </w:r>
-      <w:r>
-        <w:t xml:space="preserve">, </w:t>
-      </w:r>
-      <w:r>
-        <w:t>b</w:t>
-      </w:r>
-      <w:r>
-        <w:t>) = (q</w:t>
-      </w:r>
-      <w:r>
-        <w:t>6</w:t>
-      </w:r>
-      <w:r>
-        <w:t xml:space="preserve">, </w:t>
-      </w:r>
-      <w:r>
-        <w:t>b</w:t>
-      </w:r>
-      <w:r>
-        <w:t>, R)</w:t>
-      </w:r>
-      <w:r>
-        <w:t xml:space="preserve"> – Found an extra b</w:t>
-      </w:r>
-      <w:r>
-        <w:t xml:space="preserve"> so </w:t>
-      </w:r>
-      <w:proofErr w:type="spellStart"/>
-      <w:r>
-        <w:t>n</w:t>
-      </w:r>
-      <w:r>
-        <w:rPr>
-          <w:vertAlign w:val="subscript"/>
-        </w:rPr>
-        <w:t>a</w:t>
-      </w:r>
-      <w:proofErr w:type="spellEnd"/>
-      <w:r>
-        <w:t xml:space="preserve">(b) &gt; </w:t>
-      </w:r>
-      <w:proofErr w:type="spellStart"/>
-      <w:r>
-        <w:t>n</w:t>
-      </w:r>
-      <w:r>
-        <w:rPr>
-          <w:vertAlign w:val="subscript"/>
-        </w:rPr>
-        <w:t>a</w:t>
-      </w:r>
-      <w:proofErr w:type="spellEnd"/>
-      <w:r>
-        <w:t>(a)</w:t>
-      </w:r>
-      <w:r>
-        <w:t>, head to accept</w:t>
-      </w:r>
-    </w:p>
-    <w:p>
-      <w:pPr>
-        <w:pStyle w:val="ListParagraph"/>
-        <w:numPr>
-          <w:ilvl w:val="0"/>
-          <w:numId w:val="1"/>
-        </w:numPr>
-        <w:ind w:left="360"/>
-      </w:pPr>
-      <w:r>
-        <w:t>δ (</w:t>
-      </w:r>
-      <w:r>
-        <w:t>q5</w:t>
-      </w:r>
-      <w:r>
-        <w:t>, Y) = (</w:t>
-      </w:r>
-      <w:r>
-        <w:t>q5</w:t>
-      </w:r>
-      <w:r>
-        <w:t>, Y, R)</w:t>
-      </w:r>
-      <w:r>
-        <w:t xml:space="preserve"> – Check rest of string for unpaired b’s</w:t>
-      </w:r>
-    </w:p>
-    <w:p>
-      <w:pPr>
-        <w:pStyle w:val="ListParagraph"/>
-        <w:numPr>
-          <w:ilvl w:val="0"/>
-          <w:numId w:val="1"/>
-        </w:numPr>
-        <w:ind w:left="360"/>
-      </w:pPr>
-      <w:r>
-        <w:t>δ (</w:t>
-      </w:r>
-      <w:r>
-        <w:t>q5</w:t>
-      </w:r>
-      <w:r>
-        <w:t>, X) = (</w:t>
-      </w:r>
-      <w:r>
-        <w:t>q5</w:t>
-      </w:r>
-      <w:r>
-        <w:t>, X, R)</w:t>
-      </w:r>
-    </w:p>
-    <w:p>
-      <w:pPr>
-        <w:pStyle w:val="ListParagraph"/>
-        <w:numPr>
-          <w:ilvl w:val="0"/>
-          <w:numId w:val="1"/>
-        </w:numPr>
-        <w:ind w:left="360"/>
-      </w:pPr>
-      <w:r>
-        <w:t>δ (</w:t>
-      </w:r>
-      <w:r>
-        <w:t>q5</w:t>
-      </w:r>
-      <w:r>
-        <w:t>, a) = (</w:t>
-      </w:r>
-      <w:r>
-        <w:t>q5</w:t>
-      </w:r>
-      <w:r>
-        <w:t>, a, R)</w:t>
-      </w:r>
-    </w:p>
-    <w:p>
-      <w:pPr>
-        <w:pStyle w:val="ListParagraph"/>
-        <w:numPr>
-          <w:ilvl w:val="0"/>
-          <w:numId w:val="1"/>
-        </w:numPr>
-        <w:ind w:left="360"/>
-      </w:pPr>
-      <w:r>
-        <w:t>δ (</w:t>
-      </w:r>
-      <w:r>
-        <w:t>q5</w:t>
-      </w:r>
-      <w:r>
-        <w:t>, □) = (q</w:t>
-      </w:r>
-      <w:r>
-        <w:t>8</w:t>
-      </w:r>
-      <w:r>
-        <w:t xml:space="preserve">, □, </w:t>
-      </w:r>
-      <w:r>
-        <w:t>L</w:t>
-      </w:r>
-      <w:r>
-        <w:t>)</w:t>
-      </w:r>
-      <w:r>
-        <w:t xml:space="preserve"> – No unpaired b found</w:t>
-      </w:r>
-      <w:r>
-        <w:t>, so</w:t>
-      </w:r>
-      <w:r>
-        <w:t xml:space="preserve"> </w:t>
-      </w:r>
-      <w:proofErr w:type="spellStart"/>
-      <w:r>
-        <w:t>n</w:t>
-      </w:r>
-      <w:r>
-        <w:rPr>
-          <w:vertAlign w:val="subscript"/>
-        </w:rPr>
-        <w:t>a</w:t>
-      </w:r>
-      <w:proofErr w:type="spellEnd"/>
-      <w:r>
-        <w:t xml:space="preserve">(a) = </w:t>
-      </w:r>
-      <w:proofErr w:type="spellStart"/>
-      <w:r>
-        <w:t>n</w:t>
-      </w:r>
-      <w:r>
-        <w:rPr>
-          <w:vertAlign w:val="subscript"/>
-        </w:rPr>
-        <w:t>a</w:t>
-      </w:r>
-      <w:proofErr w:type="spellEnd"/>
-      <w:r>
-        <w:t>(b)</w:t>
-      </w:r>
-      <w:r>
-        <w:t>, rejected</w:t>
-      </w:r>
-    </w:p>
-    <w:p>
-      <w:pPr>
-        <w:pStyle w:val="ListParagraph"/>
-        <w:ind w:left="360"/>
-      </w:pPr>
-    </w:p>
-    <w:p>
-      <w:pPr>
-        <w:pStyle w:val="ListParagraph"/>
-        <w:numPr>
-          <w:ilvl w:val="0"/>
-          <w:numId w:val="1"/>
-        </w:numPr>
-        <w:ind w:left="360"/>
-      </w:pPr>
-      <w:r>
-        <w:t>δ (q</w:t>
-      </w:r>
-      <w:r>
-        <w:t>8</w:t>
-      </w:r>
-      <w:r>
-        <w:t xml:space="preserve">, □) = </w:t>
-      </w:r>
-      <w:r>
-        <w:t>rejected</w:t>
-      </w:r>
-    </w:p>
-    <w:p>
-      <w:pPr>
-        <w:pStyle w:val="ListParagraph"/>
-        <w:ind w:left="360"/>
-      </w:pPr>
-    </w:p>
-    <w:p>
-      <w:pPr>
-        <w:pStyle w:val="ListParagraph"/>
-        <w:numPr>
-          <w:ilvl w:val="0"/>
-          <w:numId w:val="1"/>
-        </w:numPr>
-        <w:ind w:left="360"/>
-      </w:pPr>
-      <w:r>
-        <w:t>δ (q6, a) = (q6, a, R) – move to end of tape to accept</w:t>
-      </w:r>
-    </w:p>
-    <w:p>
-      <w:pPr>
-        <w:pStyle w:val="ListParagraph"/>
-        <w:numPr>
-          <w:ilvl w:val="0"/>
-          <w:numId w:val="1"/>
-        </w:numPr>
-        <w:ind w:left="360"/>
-      </w:pPr>
-      <w:r>
-        <w:t>δ (q6, b) = (q6, b, R)</w:t>
-      </w:r>
-    </w:p>
-    <w:p>
-      <w:pPr>
-        <w:pStyle w:val="ListParagraph"/>
-        <w:numPr>
-          <w:ilvl w:val="0"/>
-          <w:numId w:val="1"/>
-        </w:numPr>
-        <w:ind w:left="360"/>
-      </w:pPr>
-      <w:r>
-        <w:t>δ (q6, X) = (q6, X, R)</w:t>
-      </w:r>
-    </w:p>
-    <w:p>
-      <w:pPr>
-        <w:pStyle w:val="ListParagraph"/>
-        <w:numPr>
-          <w:ilvl w:val="0"/>
-          <w:numId w:val="1"/>
-        </w:numPr>
-        <w:ind w:left="360"/>
-      </w:pPr>
-      <w:r>
-        <w:t>δ (q6, Y) = (q6, Y, R)</w:t>
-      </w:r>
-    </w:p>
-    <w:p>
-      <w:pPr>
-        <w:pStyle w:val="ListParagraph"/>
-        <w:numPr>
-          <w:ilvl w:val="0"/>
-          <w:numId w:val="1"/>
-        </w:numPr>
-        <w:ind w:left="360"/>
-      </w:pPr>
-      <w:r>
-        <w:t>δ (q</w:t>
-      </w:r>
-      <w:r>
-        <w:t>6</w:t>
-      </w:r>
-      <w:r>
-        <w:t>, □) = (q</w:t>
-      </w:r>
-      <w:r>
         <w:t>7</w:t>
       </w:r>
       <w:r>
@@ -2035,7 +1990,6 @@
         <w:t>d</w:t>
       </w:r>
     </w:p>
-    <w:p/>
     <w:p>
       <w:r>
         <w:t>Trace</w:t>
@@ -2053,10 +2007,10 @@
           <w:noProof/>
         </w:rPr>
         <w:drawing>
-          <wp:inline distT="0" distB="0" distL="0" distR="0" wp14:anchorId="35BFF72E" wp14:editId="19A958DA">
-            <wp:extent cx="3406140" cy="2824466"/>
-            <wp:effectExtent l="0" t="0" r="3810" b="0"/>
-            <wp:docPr id="859968680" name="Picture 1"/>
+          <wp:inline distT="0" distB="0" distL="0" distR="0" wp14:anchorId="18CD5F81" wp14:editId="11332311">
+            <wp:extent cx="4273008" cy="3543300"/>
+            <wp:effectExtent l="0" t="0" r="0" b="0"/>
+            <wp:docPr id="1132838062" name="Picture 5"/>
             <wp:cNvGraphicFramePr>
               <a:graphicFrameLocks xmlns:a="http://schemas.openxmlformats.org/drawingml/2006/main" noChangeAspect="1"/>
             </wp:cNvGraphicFramePr>
@@ -2064,7 +2018,7 @@
               <a:graphicData uri="http://schemas.openxmlformats.org/drawingml/2006/picture">
                 <pic:pic xmlns:pic="http://schemas.openxmlformats.org/drawingml/2006/picture">
                   <pic:nvPicPr>
-                    <pic:cNvPr id="0" name="Picture 1"/>
+                    <pic:cNvPr id="0" name="Picture 5"/>
                     <pic:cNvPicPr>
                       <a:picLocks noChangeAspect="1" noChangeArrowheads="1"/>
                     </pic:cNvPicPr>
@@ -2085,7 +2039,7 @@
                   <pic:spPr bwMode="auto">
                     <a:xfrm>
                       <a:off x="0" y="0"/>
-                      <a:ext cx="3426140" cy="2841051"/>
+                      <a:ext cx="4281885" cy="3550661"/>
                     </a:xfrm>
                     <a:prstGeom prst="rect">
                       <a:avLst/>
@@ -2110,8 +2064,8 @@
         </w:rPr>
         <w:lastRenderedPageBreak/>
         <w:drawing>
-          <wp:inline distT="0" distB="0" distL="0" distR="0" wp14:anchorId="297E3A90" wp14:editId="7C300AA1">
-            <wp:extent cx="3281737" cy="3752850"/>
+          <wp:inline distT="0" distB="0" distL="0" distR="0" wp14:anchorId="297E3A90" wp14:editId="023DA016">
+            <wp:extent cx="3531615" cy="4038600"/>
             <wp:effectExtent l="0" t="0" r="0" b="0"/>
             <wp:docPr id="1602121759" name="Picture 2"/>
             <wp:cNvGraphicFramePr>
@@ -2142,7 +2096,7 @@
                   <pic:spPr bwMode="auto">
                     <a:xfrm>
                       <a:off x="0" y="0"/>
-                      <a:ext cx="3292927" cy="3765647"/>
+                      <a:ext cx="3553326" cy="4063428"/>
                     </a:xfrm>
                     <a:prstGeom prst="rect">
                       <a:avLst/>
@@ -2159,7 +2113,6 @@
         </w:drawing>
       </w:r>
     </w:p>
-    <w:p/>
     <w:p/>
     <w:p/>
     <w:p>
@@ -4452,6 +4405,92 @@
     </w:lvl>
   </w:abstractNum>
   <w:abstractNum w:abstractNumId="1" w15:restartNumberingAfterBreak="0">
+    <w:nsid w:val="2A677D4E"/>
+    <w:multiLevelType w:val="hybridMultilevel"/>
+    <w:tmpl w:val="B9B2825C"/>
+    <w:lvl w:ilvl="0" w:tplc="FFFFFFFF">
+      <w:start w:val="1"/>
+      <w:numFmt w:val="decimal"/>
+      <w:lvlText w:val="%1."/>
+      <w:lvlJc w:val="left"/>
+      <w:pPr>
+        <w:ind w:left="360" w:hanging="360"/>
+      </w:pPr>
+    </w:lvl>
+    <w:lvl w:ilvl="1" w:tplc="FFFFFFFF" w:tentative="1">
+      <w:start w:val="1"/>
+      <w:numFmt w:val="lowerLetter"/>
+      <w:lvlText w:val="%2."/>
+      <w:lvlJc w:val="left"/>
+      <w:pPr>
+        <w:ind w:left="1080" w:hanging="360"/>
+      </w:pPr>
+    </w:lvl>
+    <w:lvl w:ilvl="2" w:tplc="FFFFFFFF" w:tentative="1">
+      <w:start w:val="1"/>
+      <w:numFmt w:val="lowerRoman"/>
+      <w:lvlText w:val="%3."/>
+      <w:lvlJc w:val="right"/>
+      <w:pPr>
+        <w:ind w:left="1800" w:hanging="180"/>
+      </w:pPr>
+    </w:lvl>
+    <w:lvl w:ilvl="3" w:tplc="FFFFFFFF" w:tentative="1">
+      <w:start w:val="1"/>
+      <w:numFmt w:val="decimal"/>
+      <w:lvlText w:val="%4."/>
+      <w:lvlJc w:val="left"/>
+      <w:pPr>
+        <w:ind w:left="2520" w:hanging="360"/>
+      </w:pPr>
+    </w:lvl>
+    <w:lvl w:ilvl="4" w:tplc="FFFFFFFF" w:tentative="1">
+      <w:start w:val="1"/>
+      <w:numFmt w:val="lowerLetter"/>
+      <w:lvlText w:val="%5."/>
+      <w:lvlJc w:val="left"/>
+      <w:pPr>
+        <w:ind w:left="3240" w:hanging="360"/>
+      </w:pPr>
+    </w:lvl>
+    <w:lvl w:ilvl="5" w:tplc="FFFFFFFF" w:tentative="1">
+      <w:start w:val="1"/>
+      <w:numFmt w:val="lowerRoman"/>
+      <w:lvlText w:val="%6."/>
+      <w:lvlJc w:val="right"/>
+      <w:pPr>
+        <w:ind w:left="3960" w:hanging="180"/>
+      </w:pPr>
+    </w:lvl>
+    <w:lvl w:ilvl="6" w:tplc="FFFFFFFF" w:tentative="1">
+      <w:start w:val="1"/>
+      <w:numFmt w:val="decimal"/>
+      <w:lvlText w:val="%7."/>
+      <w:lvlJc w:val="left"/>
+      <w:pPr>
+        <w:ind w:left="4680" w:hanging="360"/>
+      </w:pPr>
+    </w:lvl>
+    <w:lvl w:ilvl="7" w:tplc="FFFFFFFF" w:tentative="1">
+      <w:start w:val="1"/>
+      <w:numFmt w:val="lowerLetter"/>
+      <w:lvlText w:val="%8."/>
+      <w:lvlJc w:val="left"/>
+      <w:pPr>
+        <w:ind w:left="5400" w:hanging="360"/>
+      </w:pPr>
+    </w:lvl>
+    <w:lvl w:ilvl="8" w:tplc="FFFFFFFF" w:tentative="1">
+      <w:start w:val="1"/>
+      <w:numFmt w:val="lowerRoman"/>
+      <w:lvlText w:val="%9."/>
+      <w:lvlJc w:val="right"/>
+      <w:pPr>
+        <w:ind w:left="6120" w:hanging="180"/>
+      </w:pPr>
+    </w:lvl>
+  </w:abstractNum>
+  <w:abstractNum w:abstractNumId="2" w15:restartNumberingAfterBreak="0">
     <w:nsid w:val="371A268E"/>
     <w:multiLevelType w:val="hybridMultilevel"/>
     <w:tmpl w:val="57C0D172"/>
@@ -4540,7 +4579,7 @@
       </w:pPr>
     </w:lvl>
   </w:abstractNum>
-  <w:abstractNum w:abstractNumId="2" w15:restartNumberingAfterBreak="0">
+  <w:abstractNum w:abstractNumId="3" w15:restartNumberingAfterBreak="0">
     <w:nsid w:val="3EB15916"/>
     <w:multiLevelType w:val="hybridMultilevel"/>
     <w:tmpl w:val="B9B2825C"/>
@@ -4626,7 +4665,7 @@
       </w:pPr>
     </w:lvl>
   </w:abstractNum>
-  <w:abstractNum w:abstractNumId="3" w15:restartNumberingAfterBreak="0">
+  <w:abstractNum w:abstractNumId="4" w15:restartNumberingAfterBreak="0">
     <w:nsid w:val="45E11CBD"/>
     <w:multiLevelType w:val="hybridMultilevel"/>
     <w:tmpl w:val="332ECD50"/>
@@ -4715,7 +4754,7 @@
       </w:pPr>
     </w:lvl>
   </w:abstractNum>
-  <w:abstractNum w:abstractNumId="4" w15:restartNumberingAfterBreak="0">
+  <w:abstractNum w:abstractNumId="5" w15:restartNumberingAfterBreak="0">
     <w:nsid w:val="4FC214CF"/>
     <w:multiLevelType w:val="hybridMultilevel"/>
     <w:tmpl w:val="DF80B63E"/>
@@ -4804,7 +4843,7 @@
       </w:pPr>
     </w:lvl>
   </w:abstractNum>
-  <w:abstractNum w:abstractNumId="5" w15:restartNumberingAfterBreak="0">
+  <w:abstractNum w:abstractNumId="6" w15:restartNumberingAfterBreak="0">
     <w:nsid w:val="667E3C26"/>
     <w:multiLevelType w:val="hybridMultilevel"/>
     <w:tmpl w:val="1C566E9A"/>
@@ -4893,7 +4932,7 @@
       </w:pPr>
     </w:lvl>
   </w:abstractNum>
-  <w:abstractNum w:abstractNumId="6" w15:restartNumberingAfterBreak="0">
+  <w:abstractNum w:abstractNumId="7" w15:restartNumberingAfterBreak="0">
     <w:nsid w:val="68277E35"/>
     <w:multiLevelType w:val="hybridMultilevel"/>
     <w:tmpl w:val="71261F74"/>
@@ -4983,25 +5022,28 @@
     </w:lvl>
   </w:abstractNum>
   <w:num w:numId="1" w16cid:durableId="2039427546">
-    <w:abstractNumId w:val="2"/>
+    <w:abstractNumId w:val="3"/>
   </w:num>
   <w:num w:numId="2" w16cid:durableId="565534238">
+    <w:abstractNumId w:val="5"/>
+  </w:num>
+  <w:num w:numId="3" w16cid:durableId="169411143">
+    <w:abstractNumId w:val="6"/>
+  </w:num>
+  <w:num w:numId="4" w16cid:durableId="931742885">
+    <w:abstractNumId w:val="7"/>
+  </w:num>
+  <w:num w:numId="5" w16cid:durableId="1299148093">
     <w:abstractNumId w:val="4"/>
   </w:num>
-  <w:num w:numId="3" w16cid:durableId="169411143">
-    <w:abstractNumId w:val="5"/>
-  </w:num>
-  <w:num w:numId="4" w16cid:durableId="931742885">
-    <w:abstractNumId w:val="6"/>
-  </w:num>
-  <w:num w:numId="5" w16cid:durableId="1299148093">
-    <w:abstractNumId w:val="3"/>
-  </w:num>
   <w:num w:numId="6" w16cid:durableId="765735890">
-    <w:abstractNumId w:val="1"/>
+    <w:abstractNumId w:val="2"/>
   </w:num>
   <w:num w:numId="7" w16cid:durableId="863635555">
     <w:abstractNumId w:val="0"/>
+  </w:num>
+  <w:num w:numId="8" w16cid:durableId="1991055908">
+    <w:abstractNumId w:val="1"/>
   </w:num>
 </w:numbering>
 </file>

</xml_diff>